<commit_message>
Refine author contribution wording
</commit_message>
<xml_diff>
--- a/author_contribution_codex.docx
+++ b/author_contribution_codex.docx
@@ -4,80 +4,61 @@
   <w:body>
     <w:p>
       <w:pPr>
-        <w:spacing w:line="240" w:lineRule="auto" w:after="160"/>
         <w:jc w:val="left"/>
       </w:pPr>
       <w:r>
         <w:rPr>
-          <w:rFonts w:ascii="Times New Roman" w:hAnsi="Times New Roman" w:eastAsia="바탕체"/>
           <w:b/>
           <w:sz w:val="32"/>
         </w:rPr>
-        <w:t>저자별 기여도 협의록</w:t>
+        <w:t>기여도 협의록</w:t>
       </w:r>
     </w:p>
     <w:p>
       <w:pPr>
-        <w:spacing w:line="240" w:lineRule="auto" w:after="120"/>
-        <w:jc w:val="both"/>
+        <w:spacing w:after="160"/>
       </w:pPr>
       <w:r>
-        <w:rPr>
-          <w:rFonts w:ascii="Times New Roman" w:hAnsi="Times New Roman" w:eastAsia="바탕체"/>
-          <w:b w:val="0"/>
-          <w:sz w:val="20"/>
-        </w:rPr>
-        <w:t>기여율은 conceptualization/design, methodology, software, validation, investigation, data curation, formal analysis, analysis/conclusion, writing-original draft, visualization, writing-review/editing 기준으로 산정하였으며, resources, supervision, project administration은 제외하였다.</w:t>
+        <w:t>기여율은 CRediT 인정 역할(Conceptualization, Methodology, Software, Validation, Investigation, Data curation, Formal analysis, Analysis &amp; conclusion, Writing-original draft, Visualization, Writing-review/editing)을 기준으로 협의한 값이며, Resources, Supervision, Project administration은 제외하였다.</w:t>
       </w:r>
     </w:p>
     <w:tbl>
       <w:tblPr>
         <w:tblStyle w:val="TableGrid"/>
         <w:tblW w:type="auto" w:w="0"/>
-        <w:jc w:val="center"/>
         <w:tblLook w:firstColumn="1" w:firstRow="1" w:lastColumn="0" w:lastRow="0" w:noHBand="0" w:noVBand="1" w:val="04A0"/>
       </w:tblPr>
       <w:tblGrid>
-        <w:gridCol w:w="3402"/>
-        <w:gridCol w:w="3402"/>
-        <w:gridCol w:w="3402"/>
+        <w:gridCol w:w="2880"/>
+        <w:gridCol w:w="2880"/>
+        <w:gridCol w:w="2880"/>
       </w:tblGrid>
       <w:tr>
         <w:tc>
           <w:tcPr>
-            <w:tcW w:type="dxa" w:w="3402"/>
-            <w:vAlign w:val="center"/>
+            <w:tcW w:type="dxa" w:w="2880"/>
           </w:tcPr>
           <w:p>
-            <w:pPr>
-              <w:jc w:val="left"/>
-            </w:pPr>
-            <w:r/>
             <w:r>
               <w:rPr>
-                <w:rFonts w:ascii="Times New Roman" w:hAnsi="Times New Roman" w:eastAsia="바탕체"/>
+                <w:rFonts w:ascii="Malgun Gothic" w:hAnsi="Malgun Gothic"/>
                 <w:b/>
-                <w:sz w:val="20"/>
+                <w:sz w:val="18"/>
               </w:rPr>
-              <w:t>저자</w:t>
+              <w:t>기여자</w:t>
             </w:r>
           </w:p>
         </w:tc>
         <w:tc>
           <w:tcPr>
-            <w:tcW w:type="dxa" w:w="3402"/>
-            <w:vAlign w:val="center"/>
+            <w:tcW w:type="dxa" w:w="2880"/>
           </w:tcPr>
           <w:p>
-            <w:pPr>
-              <w:jc w:val="center"/>
-            </w:pPr>
-            <w:r/>
             <w:r>
               <w:rPr>
-                <w:rFonts w:ascii="Times New Roman" w:hAnsi="Times New Roman" w:eastAsia="바탕체"/>
+                <w:rFonts w:ascii="Malgun Gothic" w:hAnsi="Malgun Gothic"/>
                 <w:b/>
-                <w:sz w:val="20"/>
+                <w:sz w:val="18"/>
               </w:rPr>
               <w:t>기여율</w:t>
             </w:r>
@@ -85,19 +66,14 @@
         </w:tc>
         <w:tc>
           <w:tcPr>
-            <w:tcW w:type="dxa" w:w="3402"/>
-            <w:vAlign w:val="center"/>
+            <w:tcW w:type="dxa" w:w="2880"/>
           </w:tcPr>
           <w:p>
-            <w:pPr>
-              <w:jc w:val="left"/>
-            </w:pPr>
-            <w:r/>
             <w:r>
               <w:rPr>
-                <w:rFonts w:ascii="Times New Roman" w:hAnsi="Times New Roman" w:eastAsia="바탕체"/>
+                <w:rFonts w:ascii="Malgun Gothic" w:hAnsi="Malgun Gothic"/>
                 <w:b/>
-                <w:sz w:val="20"/>
+                <w:sz w:val="18"/>
               </w:rPr>
               <w:t>기여 내용</w:t>
             </w:r>
@@ -107,19 +83,13 @@
       <w:tr>
         <w:tc>
           <w:tcPr>
-            <w:tcW w:type="dxa" w:w="3402"/>
-            <w:vAlign w:val="center"/>
+            <w:tcW w:type="dxa" w:w="2880"/>
           </w:tcPr>
           <w:p>
-            <w:pPr>
-              <w:jc w:val="left"/>
-            </w:pPr>
-            <w:r/>
             <w:r>
               <w:rPr>
-                <w:rFonts w:ascii="Times New Roman" w:hAnsi="Times New Roman" w:eastAsia="바탕체"/>
-                <w:b w:val="0"/>
-                <w:sz w:val="20"/>
+                <w:rFonts w:ascii="Malgun Gothic" w:hAnsi="Malgun Gothic"/>
+                <w:sz w:val="18"/>
               </w:rPr>
               <w:t>최호길</w:t>
             </w:r>
@@ -127,19 +97,13 @@
         </w:tc>
         <w:tc>
           <w:tcPr>
-            <w:tcW w:type="dxa" w:w="3402"/>
-            <w:vAlign w:val="center"/>
+            <w:tcW w:type="dxa" w:w="2880"/>
           </w:tcPr>
           <w:p>
-            <w:pPr>
-              <w:jc w:val="center"/>
-            </w:pPr>
-            <w:r/>
             <w:r>
               <w:rPr>
-                <w:rFonts w:ascii="Times New Roman" w:hAnsi="Times New Roman" w:eastAsia="바탕체"/>
-                <w:b w:val="0"/>
-                <w:sz w:val="20"/>
+                <w:rFonts w:ascii="Malgun Gothic" w:hAnsi="Malgun Gothic"/>
+                <w:sz w:val="18"/>
               </w:rPr>
               <w:t>70%</w:t>
             </w:r>
@@ -147,21 +111,15 @@
         </w:tc>
         <w:tc>
           <w:tcPr>
-            <w:tcW w:type="dxa" w:w="3402"/>
-            <w:vAlign w:val="center"/>
+            <w:tcW w:type="dxa" w:w="2880"/>
           </w:tcPr>
           <w:p>
-            <w:pPr>
-              <w:jc w:val="left"/>
-            </w:pPr>
-            <w:r/>
             <w:r>
               <w:rPr>
-                <w:rFonts w:ascii="Times New Roman" w:hAnsi="Times New Roman" w:eastAsia="바탕체"/>
-                <w:b w:val="0"/>
-                <w:sz w:val="20"/>
+                <w:rFonts w:ascii="Malgun Gothic" w:hAnsi="Malgun Gothic"/>
+                <w:sz w:val="18"/>
               </w:rPr>
-              <w:t>연구 개념 구체화, 전체 기술 설계, 방법론·software 구현, 데이터 처리, 실험·검증, 분석·해석, 시각화 및 원고 초안 작성을 주도하였다.</w:t>
+              <w:t>Conceptualization, Methodology, Software, Validation, Investigation, Data curation, Formal analysis, Analysis &amp; conclusion, Writing-original draft, Visualization, Writing-review/editing을 주도하였다. Failbit Map 데이터 파이프라인, Known/Unknown 모델, chip multi-label, web app, 전체 실험과 분석, 원고와 그림 작성 전반을 직접 수행하였다.</w:t>
             </w:r>
           </w:p>
         </w:tc>
@@ -169,39 +127,27 @@
       <w:tr>
         <w:tc>
           <w:tcPr>
-            <w:tcW w:type="dxa" w:w="3402"/>
-            <w:vAlign w:val="center"/>
+            <w:tcW w:type="dxa" w:w="2880"/>
           </w:tcPr>
           <w:p>
-            <w:pPr>
-              <w:jc w:val="left"/>
-            </w:pPr>
-            <w:r/>
             <w:r>
               <w:rPr>
-                <w:rFonts w:ascii="Times New Roman" w:hAnsi="Times New Roman" w:eastAsia="바탕체"/>
-                <w:b w:val="0"/>
-                <w:sz w:val="20"/>
+                <w:rFonts w:ascii="Malgun Gothic" w:hAnsi="Malgun Gothic"/>
+                <w:sz w:val="18"/>
               </w:rPr>
-              <w:t>현업엔지니어</w:t>
+              <w:t>현업 엔지니어</w:t>
             </w:r>
           </w:p>
         </w:tc>
         <w:tc>
           <w:tcPr>
-            <w:tcW w:type="dxa" w:w="3402"/>
-            <w:vAlign w:val="center"/>
+            <w:tcW w:type="dxa" w:w="2880"/>
           </w:tcPr>
           <w:p>
-            <w:pPr>
-              <w:jc w:val="center"/>
-            </w:pPr>
-            <w:r/>
             <w:r>
               <w:rPr>
-                <w:rFonts w:ascii="Times New Roman" w:hAnsi="Times New Roman" w:eastAsia="바탕체"/>
-                <w:b w:val="0"/>
-                <w:sz w:val="20"/>
+                <w:rFonts w:ascii="Malgun Gothic" w:hAnsi="Malgun Gothic"/>
+                <w:sz w:val="18"/>
               </w:rPr>
               <w:t>15%</w:t>
             </w:r>
@@ -209,21 +155,15 @@
         </w:tc>
         <w:tc>
           <w:tcPr>
-            <w:tcW w:type="dxa" w:w="3402"/>
-            <w:vAlign w:val="center"/>
+            <w:tcW w:type="dxa" w:w="2880"/>
           </w:tcPr>
           <w:p>
-            <w:pPr>
-              <w:jc w:val="left"/>
-            </w:pPr>
-            <w:r/>
             <w:r>
               <w:rPr>
-                <w:rFonts w:ascii="Times New Roman" w:hAnsi="Times New Roman" w:eastAsia="바탕체"/>
-                <w:b w:val="0"/>
-                <w:sz w:val="20"/>
+                <w:rFonts w:ascii="Malgun Gothic" w:hAnsi="Malgun Gothic"/>
+                <w:sz w:val="18"/>
               </w:rPr>
-              <w:t>현장 문제와 Known failure 초기 아이디어를 제시하고, web application·대량 이미지 생성 필요성 제안 및 초기 labeling·validation을 지원하였다.</w:t>
+              <w:t>현장 문제와 핵심 아이디어(Known 접근, web app, 평가용 대량 이미지)를 처음 제기하여 Conceptualization을 공동 주도했고, 초기 labeling으로 Investigation과 Data curation을 지원하였다.</w:t>
             </w:r>
           </w:p>
         </w:tc>
@@ -231,19 +171,13 @@
       <w:tr>
         <w:tc>
           <w:tcPr>
-            <w:tcW w:type="dxa" w:w="3402"/>
-            <w:vAlign w:val="center"/>
+            <w:tcW w:type="dxa" w:w="2880"/>
           </w:tcPr>
           <w:p>
-            <w:pPr>
-              <w:jc w:val="left"/>
-            </w:pPr>
-            <w:r/>
             <w:r>
               <w:rPr>
-                <w:rFonts w:ascii="Times New Roman" w:hAnsi="Times New Roman" w:eastAsia="바탕체"/>
-                <w:b w:val="0"/>
-                <w:sz w:val="20"/>
+                <w:rFonts w:ascii="Malgun Gothic" w:hAnsi="Malgun Gothic"/>
+                <w:sz w:val="18"/>
               </w:rPr>
               <w:t>관리자</w:t>
             </w:r>
@@ -251,19 +185,13 @@
         </w:tc>
         <w:tc>
           <w:tcPr>
-            <w:tcW w:type="dxa" w:w="3402"/>
-            <w:vAlign w:val="center"/>
+            <w:tcW w:type="dxa" w:w="2880"/>
           </w:tcPr>
           <w:p>
-            <w:pPr>
-              <w:jc w:val="center"/>
-            </w:pPr>
-            <w:r/>
             <w:r>
               <w:rPr>
-                <w:rFonts w:ascii="Times New Roman" w:hAnsi="Times New Roman" w:eastAsia="바탕체"/>
-                <w:b w:val="0"/>
-                <w:sz w:val="20"/>
+                <w:rFonts w:ascii="Malgun Gothic" w:hAnsi="Malgun Gothic"/>
+                <w:sz w:val="18"/>
               </w:rPr>
               <w:t>15%</w:t>
             </w:r>
@@ -271,29 +199,23 @@
         </w:tc>
         <w:tc>
           <w:tcPr>
-            <w:tcW w:type="dxa" w:w="3402"/>
-            <w:vAlign w:val="center"/>
+            <w:tcW w:type="dxa" w:w="2880"/>
           </w:tcPr>
           <w:p>
-            <w:pPr>
-              <w:jc w:val="left"/>
-            </w:pPr>
-            <w:r/>
             <w:r>
               <w:rPr>
-                <w:rFonts w:ascii="Times New Roman" w:hAnsi="Times New Roman" w:eastAsia="바탕체"/>
-                <w:b w:val="0"/>
-                <w:sz w:val="20"/>
+                <w:rFonts w:ascii="Malgun Gothic" w:hAnsi="Malgun Gothic"/>
+                <w:sz w:val="18"/>
               </w:rPr>
-              <w:t>연구 목표와 논문 구성에 대한 conceptualization/design 피드백을 제공하고, 문제 정의·서술 흐름·revision 방향에 대한 writing-review/editing을 수행하였다.</w:t>
+              <w:t>논문 작성 가이드와 초고 검토를 통해 Writing-review/editing을 지원하였다. 방향성 제시와 진행 관리는 Supervision, Project administration에 해당하므로 기여율 산정에서는 제외하였다.</w:t>
             </w:r>
           </w:p>
         </w:tc>
       </w:tr>
     </w:tbl>
     <w:sectPr>
-      <w:pgSz w:w="11906" w:h="16838"/>
-      <w:pgMar w:top="850" w:right="850" w:bottom="850" w:left="850" w:header="720" w:footer="720" w:gutter="0"/>
+      <w:pgSz w:w="12240" w:h="15840"/>
+      <w:pgMar w:top="1440" w:right="1800" w:bottom="1440" w:left="1800" w:header="720" w:footer="720" w:gutter="0"/>
       <w:cols w:space="720"/>
       <w:docGrid w:linePitch="360"/>
     </w:sectPr>
@@ -664,6 +586,10 @@
     <w:name w:val="Normal"/>
     <w:qFormat/>
     <w:rsid w:val="00FC693F"/>
+    <w:rPr>
+      <w:rFonts w:ascii="Malgun Gothic" w:hAnsi="Malgun Gothic"/>
+      <w:sz w:val="20"/>
+    </w:rPr>
   </w:style>
   <w:style w:type="paragraph" w:styleId="Header">
     <w:name w:val="header"/>

</xml_diff>

<commit_message>
Expand contribution role descriptions
</commit_message>
<xml_diff>
--- a/author_contribution_codex.docx
+++ b/author_contribution_codex.docx
@@ -163,7 +163,7 @@
                 <w:rFonts w:ascii="Malgun Gothic" w:hAnsi="Malgun Gothic"/>
                 <w:sz w:val="18"/>
               </w:rPr>
-              <w:t>현장 문제와 핵심 아이디어(Known 접근, web app, 평가용 대량 이미지)를 처음 제기하여 Conceptualization을 공동 주도했고, 초기 labeling으로 Investigation과 Data curation을 지원하였다.</w:t>
+              <w:t>현장 문제와 핵심 아이디어(Known 접근, web app, 평가용 대량 이미지)를 처음 제기하여 Conceptualization을 공동 주도하였다. 초기 labeling과 현업 관점의 결과 확인으로 Investigation, Data curation, Validation을 지원하였다.</w:t>
             </w:r>
           </w:p>
         </w:tc>
@@ -207,7 +207,7 @@
                 <w:rFonts w:ascii="Malgun Gothic" w:hAnsi="Malgun Gothic"/>
                 <w:sz w:val="18"/>
               </w:rPr>
-              <w:t>논문 작성 가이드와 초고 검토를 통해 Writing-review/editing을 지원하였다. 방향성 제시와 진행 관리는 Supervision, Project administration에 해당하므로 기여율 산정에서는 제외하였다.</w:t>
+              <w:t>연구 목표 설정과 논문 구성에 대한 Conceptualization 피드백을 제공하고, 결과 해석과 결론 정리에 대한 Analysis &amp; conclusion 검토를 지원하였다. 원고 구조와 표현 수정은 Writing-review/editing으로 반영하였다. 일반적인 방향성 제시와 진행 관리는 Supervision, Project administration에 해당하므로 기여율 산정에서는 제외하였다.</w:t>
             </w:r>
           </w:p>
         </w:tc>

</xml_diff>

<commit_message>
Use contribution role terminology
</commit_message>
<xml_diff>
--- a/author_contribution_codex.docx
+++ b/author_contribution_codex.docx
@@ -9,23 +9,21 @@
       <w:r>
         <w:rPr>
           <w:b/>
-          <w:sz w:val="32"/>
+          <w:sz w:val="28"/>
         </w:rPr>
         <w:t>기여도 협의록</w:t>
       </w:r>
     </w:p>
     <w:p>
-      <w:pPr>
-        <w:spacing w:after="160"/>
-      </w:pPr>
       <w:r>
-        <w:t>기여율은 CRediT 인정 역할(Conceptualization, Methodology, Software, Validation, Investigation, Data curation, Formal analysis, Analysis &amp; conclusion, Writing-original draft, Visualization, Writing-review/editing)을 기준으로 협의한 값이며, Resources, Supervision, Project administration은 제외하였다.</w:t>
+        <w:t>기여율은 CRediT 인정 역할(Conceptualization and design, Methodology, Software, Validation, Investigation, Data curation, Formal analysis, Analysis and conclusion, Writing-original draft, Visualization, Writing-review/editing)을 기준으로 협의한 값이며, Resources, Supervision, Project administration은 제외하였다.</w:t>
       </w:r>
     </w:p>
     <w:tbl>
       <w:tblPr>
         <w:tblStyle w:val="TableGrid"/>
         <w:tblW w:type="auto" w:w="0"/>
+        <w:jc w:val="center"/>
         <w:tblLook w:firstColumn="1" w:firstRow="1" w:lastColumn="0" w:lastRow="0" w:noHBand="0" w:noVBand="1" w:val="04A0"/>
       </w:tblPr>
       <w:tblGrid>
@@ -36,14 +34,14 @@
       <w:tr>
         <w:tc>
           <w:tcPr>
-            <w:tcW w:type="dxa" w:w="2880"/>
+            <w:tcW w:type="dxa" w:w="1400"/>
           </w:tcPr>
           <w:p>
             <w:r>
               <w:rPr>
-                <w:rFonts w:ascii="Malgun Gothic" w:hAnsi="Malgun Gothic"/>
+                <w:rFonts w:ascii="Malgun Gothic" w:hAnsi="Malgun Gothic" w:eastAsia="Malgun Gothic"/>
                 <w:b/>
-                <w:sz w:val="18"/>
+                <w:sz w:val="20"/>
               </w:rPr>
               <w:t>기여자</w:t>
             </w:r>
@@ -51,14 +49,14 @@
         </w:tc>
         <w:tc>
           <w:tcPr>
-            <w:tcW w:type="dxa" w:w="2880"/>
+            <w:tcW w:type="dxa" w:w="900"/>
           </w:tcPr>
           <w:p>
             <w:r>
               <w:rPr>
-                <w:rFonts w:ascii="Malgun Gothic" w:hAnsi="Malgun Gothic"/>
+                <w:rFonts w:ascii="Malgun Gothic" w:hAnsi="Malgun Gothic" w:eastAsia="Malgun Gothic"/>
                 <w:b/>
-                <w:sz w:val="18"/>
+                <w:sz w:val="20"/>
               </w:rPr>
               <w:t>기여율</w:t>
             </w:r>
@@ -66,14 +64,14 @@
         </w:tc>
         <w:tc>
           <w:tcPr>
-            <w:tcW w:type="dxa" w:w="2880"/>
+            <w:tcW w:type="dxa" w:w="7600"/>
           </w:tcPr>
           <w:p>
             <w:r>
               <w:rPr>
-                <w:rFonts w:ascii="Malgun Gothic" w:hAnsi="Malgun Gothic"/>
+                <w:rFonts w:ascii="Malgun Gothic" w:hAnsi="Malgun Gothic" w:eastAsia="Malgun Gothic"/>
                 <w:b/>
-                <w:sz w:val="18"/>
+                <w:sz w:val="20"/>
               </w:rPr>
               <w:t>기여 내용</w:t>
             </w:r>
@@ -83,13 +81,14 @@
       <w:tr>
         <w:tc>
           <w:tcPr>
-            <w:tcW w:type="dxa" w:w="2880"/>
+            <w:tcW w:type="dxa" w:w="1400"/>
+            <w:vAlign w:val="top"/>
           </w:tcPr>
           <w:p>
             <w:r>
               <w:rPr>
-                <w:rFonts w:ascii="Malgun Gothic" w:hAnsi="Malgun Gothic"/>
-                <w:sz w:val="18"/>
+                <w:rFonts w:ascii="Malgun Gothic" w:hAnsi="Malgun Gothic" w:eastAsia="Malgun Gothic"/>
+                <w:sz w:val="20"/>
               </w:rPr>
               <w:t>최호길</w:t>
             </w:r>
@@ -97,13 +96,14 @@
         </w:tc>
         <w:tc>
           <w:tcPr>
-            <w:tcW w:type="dxa" w:w="2880"/>
+            <w:tcW w:type="dxa" w:w="900"/>
+            <w:vAlign w:val="top"/>
           </w:tcPr>
           <w:p>
             <w:r>
               <w:rPr>
-                <w:rFonts w:ascii="Malgun Gothic" w:hAnsi="Malgun Gothic"/>
-                <w:sz w:val="18"/>
+                <w:rFonts w:ascii="Malgun Gothic" w:hAnsi="Malgun Gothic" w:eastAsia="Malgun Gothic"/>
+                <w:sz w:val="20"/>
               </w:rPr>
               <w:t>70%</w:t>
             </w:r>
@@ -111,15 +111,16 @@
         </w:tc>
         <w:tc>
           <w:tcPr>
-            <w:tcW w:type="dxa" w:w="2880"/>
+            <w:tcW w:type="dxa" w:w="7600"/>
+            <w:vAlign w:val="top"/>
           </w:tcPr>
           <w:p>
             <w:r>
               <w:rPr>
-                <w:rFonts w:ascii="Malgun Gothic" w:hAnsi="Malgun Gothic"/>
-                <w:sz w:val="18"/>
+                <w:rFonts w:ascii="Malgun Gothic" w:hAnsi="Malgun Gothic" w:eastAsia="Malgun Gothic"/>
+                <w:sz w:val="20"/>
               </w:rPr>
-              <w:t>연구 기획, 방법론 설계, software 구현, 데이터 처리, 실험과 검증, 정량 분석, 시각화, 원고 작성과 수정을 주도하였다.</w:t>
+              <w:t>Conceptualization and design, Methodology, Software, Validation, Investigation, Data curation, Formal analysis, Analysis and conclusion, Writing-original draft, Visualization, Writing-review/editing을 주도하였다.</w:t>
             </w:r>
           </w:p>
         </w:tc>
@@ -127,13 +128,14 @@
       <w:tr>
         <w:tc>
           <w:tcPr>
-            <w:tcW w:type="dxa" w:w="2880"/>
+            <w:tcW w:type="dxa" w:w="1400"/>
+            <w:vAlign w:val="top"/>
           </w:tcPr>
           <w:p>
             <w:r>
               <w:rPr>
-                <w:rFonts w:ascii="Malgun Gothic" w:hAnsi="Malgun Gothic"/>
-                <w:sz w:val="18"/>
+                <w:rFonts w:ascii="Malgun Gothic" w:hAnsi="Malgun Gothic" w:eastAsia="Malgun Gothic"/>
+                <w:sz w:val="20"/>
               </w:rPr>
               <w:t>현업 엔지니어</w:t>
             </w:r>
@@ -141,13 +143,14 @@
         </w:tc>
         <w:tc>
           <w:tcPr>
-            <w:tcW w:type="dxa" w:w="2880"/>
+            <w:tcW w:type="dxa" w:w="900"/>
+            <w:vAlign w:val="top"/>
           </w:tcPr>
           <w:p>
             <w:r>
               <w:rPr>
-                <w:rFonts w:ascii="Malgun Gothic" w:hAnsi="Malgun Gothic"/>
-                <w:sz w:val="18"/>
+                <w:rFonts w:ascii="Malgun Gothic" w:hAnsi="Malgun Gothic" w:eastAsia="Malgun Gothic"/>
+                <w:sz w:val="20"/>
               </w:rPr>
               <w:t>15%</w:t>
             </w:r>
@@ -155,15 +158,16 @@
         </w:tc>
         <w:tc>
           <w:tcPr>
-            <w:tcW w:type="dxa" w:w="2880"/>
+            <w:tcW w:type="dxa" w:w="7600"/>
+            <w:vAlign w:val="top"/>
           </w:tcPr>
           <w:p>
             <w:r>
               <w:rPr>
-                <w:rFonts w:ascii="Malgun Gothic" w:hAnsi="Malgun Gothic"/>
-                <w:sz w:val="18"/>
+                <w:rFonts w:ascii="Malgun Gothic" w:hAnsi="Malgun Gothic" w:eastAsia="Malgun Gothic"/>
+                <w:sz w:val="20"/>
               </w:rPr>
-              <w:t>현장 문제 정의와 요구사항 도출에 기여하고, 초기 labeling과 결과 확인을 지원하였다.</w:t>
+              <w:t>Conceptualization and design, Validation, Investigation, Data curation을 지원하였다.</w:t>
             </w:r>
           </w:p>
         </w:tc>
@@ -171,13 +175,14 @@
       <w:tr>
         <w:tc>
           <w:tcPr>
-            <w:tcW w:type="dxa" w:w="2880"/>
+            <w:tcW w:type="dxa" w:w="1400"/>
+            <w:vAlign w:val="top"/>
           </w:tcPr>
           <w:p>
             <w:r>
               <w:rPr>
-                <w:rFonts w:ascii="Malgun Gothic" w:hAnsi="Malgun Gothic"/>
-                <w:sz w:val="18"/>
+                <w:rFonts w:ascii="Malgun Gothic" w:hAnsi="Malgun Gothic" w:eastAsia="Malgun Gothic"/>
+                <w:sz w:val="20"/>
               </w:rPr>
               <w:t>관리자</w:t>
             </w:r>
@@ -185,13 +190,14 @@
         </w:tc>
         <w:tc>
           <w:tcPr>
-            <w:tcW w:type="dxa" w:w="2880"/>
+            <w:tcW w:type="dxa" w:w="900"/>
+            <w:vAlign w:val="top"/>
           </w:tcPr>
           <w:p>
             <w:r>
               <w:rPr>
-                <w:rFonts w:ascii="Malgun Gothic" w:hAnsi="Malgun Gothic"/>
-                <w:sz w:val="18"/>
+                <w:rFonts w:ascii="Malgun Gothic" w:hAnsi="Malgun Gothic" w:eastAsia="Malgun Gothic"/>
+                <w:sz w:val="20"/>
               </w:rPr>
               <w:t>15%</w:t>
             </w:r>
@@ -199,15 +205,16 @@
         </w:tc>
         <w:tc>
           <w:tcPr>
-            <w:tcW w:type="dxa" w:w="2880"/>
+            <w:tcW w:type="dxa" w:w="7600"/>
+            <w:vAlign w:val="top"/>
           </w:tcPr>
           <w:p>
             <w:r>
               <w:rPr>
-                <w:rFonts w:ascii="Malgun Gothic" w:hAnsi="Malgun Gothic"/>
-                <w:sz w:val="18"/>
+                <w:rFonts w:ascii="Malgun Gothic" w:hAnsi="Malgun Gothic" w:eastAsia="Malgun Gothic"/>
+                <w:sz w:val="20"/>
               </w:rPr>
-              <w:t>연구 목표와 논문 구성에 대한 피드백을 제공하고, 결과 해석, 결론 정리, 원고 검토와 수정 방향을 지원하였다. 일반적인 방향성 제시와 진행 관리는 Supervision, Project administration에 해당하므로 기여율 산정에서는 제외하였다.</w:t>
+              <w:t>Conceptualization and design, Analysis and conclusion, Writing-review/editing을 지원하였다. Resources, Supervision, Project administration 성격의 활동은 기여율 산정에서 제외하였다.</w:t>
             </w:r>
           </w:p>
         </w:tc>
@@ -587,7 +594,7 @@
     <w:qFormat/>
     <w:rsid w:val="00FC693F"/>
     <w:rPr>
-      <w:rFonts w:ascii="Malgun Gothic" w:hAnsi="Malgun Gothic"/>
+      <w:rFonts w:ascii="Malgun Gothic" w:hAnsi="Malgun Gothic" w:eastAsia="Malgun Gothic"/>
       <w:sz w:val="20"/>
     </w:rPr>
   </w:style>

</xml_diff>